<commit_message>
Taxonomy Guide: align severity scale with Concepts Primer; offline gold-set labelling tool and label import
</commit_message>
<xml_diff>
--- a/W01_Taxonomy_Guide.docx
+++ b/W01_Taxonomy_Guide.docx
@@ -2047,7 +2047,7 @@
               <w:spacing w:after="0" w:line="240" w:lineRule="auto"/>
             </w:pPr>
             <w:r>
-              <w:t>No task impact; cosmetic or informational.</w:t>
+              <w:t>Incident noted; robot continued its mission.</w:t>
             </w:r>
           </w:p>
         </w:tc>
@@ -2088,7 +2088,7 @@
               <w:spacing w:after="0" w:line="240" w:lineRule="auto"/>
             </w:pPr>
             <w:r>
-              <w:t>Task degraded or delayed; robot recovered on its own.</w:t>
+              <w:t>Mission interrupted; robot resumed under its own operation.</w:t>
             </w:r>
           </w:p>
         </w:tc>
@@ -2116,7 +2116,7 @@
               <w:spacing w:after="0" w:line="240" w:lineRule="auto"/>
             </w:pPr>
             <w:r>
-              <w:t>3 Major</w:t>
+              <w:t>3 Serious</w:t>
             </w:r>
           </w:p>
         </w:tc>
@@ -2129,7 +2129,7 @@
               <w:spacing w:after="0" w:line="240" w:lineRule="auto"/>
             </w:pPr>
             <w:r>
-              <w:t>Task stopped; human intervention needed.</w:t>
+              <w:t>Human intervention required to resume.</w:t>
             </w:r>
           </w:p>
         </w:tc>
@@ -2170,7 +2170,7 @@
               <w:spacing w:after="0" w:line="240" w:lineRule="auto"/>
             </w:pPr>
             <w:r>
-              <w:t>Safety risk, damage, or extended outage (&gt; 1 shift).</w:t>
+              <w:t>Robot out of service, requiring maintenance or replacement; or a safety risk.</w:t>
             </w:r>
           </w:p>
         </w:tc>
@@ -2183,7 +2183,7 @@
               <w:spacing w:after="0" w:line="240" w:lineRule="auto"/>
             </w:pPr>
             <w:r>
-              <w:t>Collision with person/vehicle; unit offline overnight.</w:t>
+              <w:t>Battery failure, rover stranded; collision with a person.</w:t>
             </w:r>
           </w:p>
         </w:tc>
@@ -2191,7 +2191,7 @@
     </w:tbl>
     <w:p>
       <w:r>
-        <w:t>Rule: rate by impact actually reported, not by worst case imagined. If impact is not described, choose the lowest level the text supports.</w:t>
+        <w:t>Rule: rate by impact actually reported, not by worst case imagined. If impact is not described, choose the lowest level the text supports. Severity is labelled separately from category: a battery incident can be Level 1 (low-battery warning, mission completed) or Level 4 (battery failure, robot stranded). Definitions follow the programme Concepts Primer.</w:t>
       </w:r>
     </w:p>
     <w:p>

</xml_diff>